<commit_message>
fix: close Phase 7B claim boundaries
</commit_message>
<xml_diff>
--- a/docs/summary/research_summary.docx
+++ b/docs/summary/research_summary.docx
@@ -129,7 +129,7 @@
           <w:color w:val="525960"/>
           <w:sz w:val="16"/>
         </w:rPr>
-        <w:t>Evidence snapshot: 7.283% nominal objective reduction; 10/13 deterministic scenarios passed; 30/30 vs 0/30 isolated-noise vs combined-stress trials</w:t>
+        <w:t>Evidence snapshot: 7.283% nominal objective reduction; 10/13 optimized PID deterministic scenarios passed; 30/30 vs 0/30 per controller-scenario cell: isolated-noise cell vs full-combined-stress cell</w:t>
       </w:r>
     </w:p>
     <w:tbl>
@@ -230,7 +230,7 @@
                 <w:color w:val="525960"/>
                 <w:sz w:val="16"/>
               </w:rPr>
-              <w:t>deterministic scenarios passed</w:t>
+              <w:t>optimized PID deterministic scenarios passed</w:t>
             </w:r>
           </w:p>
         </w:tc>
@@ -273,7 +273,7 @@
                 <w:color w:val="525960"/>
                 <w:sz w:val="16"/>
               </w:rPr>
-              <w:t>isolated-noise vs combined-stress trials</w:t>
+              <w:t>per controller-scenario cell: isolated-noise cell vs full-combined-stress cell</w:t>
             </w:r>
           </w:p>
         </w:tc>
@@ -436,7 +436,7 @@
           <w:color w:val="525960"/>
           <w:sz w:val="15"/>
         </w:rPr>
-        <w:t>Sources: docs/report/technical_report.md | results/report/report_evidence.json | docs/report/PAPER_CLAIM_AUDIT.md</w:t>
+        <w:t>Sources: docs/report/technical_report.md | results/report/report_evidence.json | docs/report/build_manifest.json</w:t>
       </w:r>
     </w:p>
     <w:sectPr>

</xml_diff>